<commit_message>
Tema 2 cevap anahtari kitap yapisina birebir uyduruldu: Dusun Hatirla 2.1-2.2 eklendi, AK 2.1-2.12 cevaplari asama ve maddelere bolundu, Tartisma 2.1 maddelere ayrildi, SS 2.11 1. soru harfleri duzeltildi; 2.4'te Sira Sizde 2. sorunun eksik cizgi-bag formulleri icin dizgi notu eklendi
</commit_message>
<xml_diff>
--- a/Kim12-2-4-Organik-Bilesiklerin-Formulleri.docx
+++ b/Kim12-2-4-Organik-Bilesiklerin-Formulleri.docx
@@ -6519,6 +6519,112 @@
           <w:lang w:val="tr-TR"/>
         </w:rPr>
         <w:t xml:space="preserve">2. Çizgi-bağ formülleri verilen bileşiklerin açık formüllerini çiziniz ve molekül formüllerini yazınız.</w:t>
+      </w:r>
+    </w:p>
+    <w:p>
+      <w:pPr>
+        <w:jc w:val="both"/>
+        <w:rPr>
+          <w:rFonts w:ascii="Times New Roman" w:hAnsi="Times New Roman" w:cs="Times New Roman"/>
+          <w:lang w:val="tr-TR"/>
+        </w:rPr>
+      </w:pPr>
+      <w:r>
+        <w:rPr>
+          <w:rFonts w:ascii="Times New Roman" w:hAnsi="Times New Roman" w:cs="Times New Roman"/>
+          <w:lang w:val="tr-TR"/>
+        </w:rPr>
+        <w:t xml:space="preserve">NOT: Soru metninin altına, çizim kutusunun üstüne üç çizgi-bağ formülü yan yana konulsun: a. beş köşeli halka (siklopentan, C</w:t>
+      </w:r>
+      <w:r>
+        <w:rPr>
+          <w:rFonts w:ascii="Times New Roman" w:hAnsi="Times New Roman" w:cs="Times New Roman"/>
+          <w:lang w:val="tr-TR"/>
+          <w:vertAlign w:val="subscript"/>
+        </w:rPr>
+        <w:t xml:space="preserve">5</w:t>
+      </w:r>
+      <w:r>
+        <w:rPr>
+          <w:rFonts w:ascii="Times New Roman" w:hAnsi="Times New Roman" w:cs="Times New Roman"/>
+          <w:lang w:val="tr-TR"/>
+        </w:rPr>
+        <w:t xml:space="preserve">H</w:t>
+      </w:r>
+      <w:r>
+        <w:rPr>
+          <w:rFonts w:ascii="Times New Roman" w:hAnsi="Times New Roman" w:cs="Times New Roman"/>
+          <w:lang w:val="tr-TR"/>
+          <w:vertAlign w:val="subscript"/>
+        </w:rPr>
+        <w:t xml:space="preserve">10</w:t>
+      </w:r>
+      <w:r>
+        <w:rPr>
+          <w:rFonts w:ascii="Times New Roman" w:hAnsi="Times New Roman" w:cs="Times New Roman"/>
+          <w:lang w:val="tr-TR"/>
+        </w:rPr>
+        <w:t xml:space="preserve">); b. altı karbonlu zikzak zincir, soldan 2. ve 3. karbon atomları arasında ikili bağ (hekz-2-en, C</w:t>
+      </w:r>
+      <w:r>
+        <w:rPr>
+          <w:rFonts w:ascii="Times New Roman" w:hAnsi="Times New Roman" w:cs="Times New Roman"/>
+          <w:lang w:val="tr-TR"/>
+          <w:vertAlign w:val="subscript"/>
+        </w:rPr>
+        <w:t xml:space="preserve">6</w:t>
+      </w:r>
+      <w:r>
+        <w:rPr>
+          <w:rFonts w:ascii="Times New Roman" w:hAnsi="Times New Roman" w:cs="Times New Roman"/>
+          <w:lang w:val="tr-TR"/>
+        </w:rPr>
+        <w:t xml:space="preserve">H</w:t>
+      </w:r>
+      <w:r>
+        <w:rPr>
+          <w:rFonts w:ascii="Times New Roman" w:hAnsi="Times New Roman" w:cs="Times New Roman"/>
+          <w:lang w:val="tr-TR"/>
+          <w:vertAlign w:val="subscript"/>
+        </w:rPr>
+        <w:t xml:space="preserve">12</w:t>
+      </w:r>
+      <w:r>
+        <w:rPr>
+          <w:rFonts w:ascii="Times New Roman" w:hAnsi="Times New Roman" w:cs="Times New Roman"/>
+          <w:lang w:val="tr-TR"/>
+        </w:rPr>
+        <w:t xml:space="preserve">); c. beş karbonlu zikzak zincir, soldan 2. karbon atomuna bağlı OH grubu (pentan-2-ol, C</w:t>
+      </w:r>
+      <w:r>
+        <w:rPr>
+          <w:rFonts w:ascii="Times New Roman" w:hAnsi="Times New Roman" w:cs="Times New Roman"/>
+          <w:lang w:val="tr-TR"/>
+          <w:vertAlign w:val="subscript"/>
+        </w:rPr>
+        <w:t xml:space="preserve">5</w:t>
+      </w:r>
+      <w:r>
+        <w:rPr>
+          <w:rFonts w:ascii="Times New Roman" w:hAnsi="Times New Roman" w:cs="Times New Roman"/>
+          <w:lang w:val="tr-TR"/>
+        </w:rPr>
+        <w:t xml:space="preserve">H</w:t>
+      </w:r>
+      <w:r>
+        <w:rPr>
+          <w:rFonts w:ascii="Times New Roman" w:hAnsi="Times New Roman" w:cs="Times New Roman"/>
+          <w:lang w:val="tr-TR"/>
+          <w:vertAlign w:val="subscript"/>
+        </w:rPr>
+        <w:t xml:space="preserve">12</w:t>
+      </w:r>
+      <w:r>
+        <w:rPr>
+          <w:rFonts w:ascii="Times New Roman" w:hAnsi="Times New Roman" w:cs="Times New Roman"/>
+          <w:lang w:val="tr-TR"/>
+        </w:rPr>
+        <w:t xml:space="preserve">O).</w:t>
       </w:r>
     </w:p>
     <w:p xmlns:a="http://schemas.openxmlformats.org/drawingml/2006/main" xmlns:pic="http://schemas.openxmlformats.org/drawingml/2006/picture">

</xml_diff>

<commit_message>
Gorsellerdeki harf etiketleri a) yerine a. bicimine cevrildi (2.1 orbital ortusmeleri, 2.4 SS cizgi-bag formulleri, 2.6 iki yapi tablosu ve SS gorselleri, Organik Bilesikler bolum sonu 5. soru, unite sonu 33. soru); 2.6 SS tablo hucrelerindeki harfler duzeltildi; 2.4'teki gereksiz dizgi notu kaldirildi
</commit_message>
<xml_diff>
--- a/Kim12-2-4-Organik-Bilesiklerin-Formulleri.docx
+++ b/Kim12-2-4-Organik-Bilesiklerin-Formulleri.docx
@@ -6519,112 +6519,6 @@
           <w:lang w:val="tr-TR"/>
         </w:rPr>
         <w:t xml:space="preserve">2. Çizgi-bağ formülleri verilen bileşiklerin açık formüllerini çiziniz ve molekül formüllerini yazınız.</w:t>
-      </w:r>
-    </w:p>
-    <w:p>
-      <w:pPr>
-        <w:jc w:val="both"/>
-        <w:rPr>
-          <w:rFonts w:ascii="Times New Roman" w:hAnsi="Times New Roman" w:cs="Times New Roman"/>
-          <w:lang w:val="tr-TR"/>
-        </w:rPr>
-      </w:pPr>
-      <w:r>
-        <w:rPr>
-          <w:rFonts w:ascii="Times New Roman" w:hAnsi="Times New Roman" w:cs="Times New Roman"/>
-          <w:lang w:val="tr-TR"/>
-        </w:rPr>
-        <w:t xml:space="preserve">NOT: Soru metninin altına, çizim kutusunun üstüne üç çizgi-bağ formülü yan yana konulsun: a. beş köşeli halka (siklopentan, C</w:t>
-      </w:r>
-      <w:r>
-        <w:rPr>
-          <w:rFonts w:ascii="Times New Roman" w:hAnsi="Times New Roman" w:cs="Times New Roman"/>
-          <w:lang w:val="tr-TR"/>
-          <w:vertAlign w:val="subscript"/>
-        </w:rPr>
-        <w:t xml:space="preserve">5</w:t>
-      </w:r>
-      <w:r>
-        <w:rPr>
-          <w:rFonts w:ascii="Times New Roman" w:hAnsi="Times New Roman" w:cs="Times New Roman"/>
-          <w:lang w:val="tr-TR"/>
-        </w:rPr>
-        <w:t xml:space="preserve">H</w:t>
-      </w:r>
-      <w:r>
-        <w:rPr>
-          <w:rFonts w:ascii="Times New Roman" w:hAnsi="Times New Roman" w:cs="Times New Roman"/>
-          <w:lang w:val="tr-TR"/>
-          <w:vertAlign w:val="subscript"/>
-        </w:rPr>
-        <w:t xml:space="preserve">10</w:t>
-      </w:r>
-      <w:r>
-        <w:rPr>
-          <w:rFonts w:ascii="Times New Roman" w:hAnsi="Times New Roman" w:cs="Times New Roman"/>
-          <w:lang w:val="tr-TR"/>
-        </w:rPr>
-        <w:t xml:space="preserve">); b. altı karbonlu zikzak zincir, soldan 2. ve 3. karbon atomları arasında ikili bağ (hekz-2-en, C</w:t>
-      </w:r>
-      <w:r>
-        <w:rPr>
-          <w:rFonts w:ascii="Times New Roman" w:hAnsi="Times New Roman" w:cs="Times New Roman"/>
-          <w:lang w:val="tr-TR"/>
-          <w:vertAlign w:val="subscript"/>
-        </w:rPr>
-        <w:t xml:space="preserve">6</w:t>
-      </w:r>
-      <w:r>
-        <w:rPr>
-          <w:rFonts w:ascii="Times New Roman" w:hAnsi="Times New Roman" w:cs="Times New Roman"/>
-          <w:lang w:val="tr-TR"/>
-        </w:rPr>
-        <w:t xml:space="preserve">H</w:t>
-      </w:r>
-      <w:r>
-        <w:rPr>
-          <w:rFonts w:ascii="Times New Roman" w:hAnsi="Times New Roman" w:cs="Times New Roman"/>
-          <w:lang w:val="tr-TR"/>
-          <w:vertAlign w:val="subscript"/>
-        </w:rPr>
-        <w:t xml:space="preserve">12</w:t>
-      </w:r>
-      <w:r>
-        <w:rPr>
-          <w:rFonts w:ascii="Times New Roman" w:hAnsi="Times New Roman" w:cs="Times New Roman"/>
-          <w:lang w:val="tr-TR"/>
-        </w:rPr>
-        <w:t xml:space="preserve">); c. beş karbonlu zikzak zincir, soldan 2. karbon atomuna bağlı OH grubu (pentan-2-ol, C</w:t>
-      </w:r>
-      <w:r>
-        <w:rPr>
-          <w:rFonts w:ascii="Times New Roman" w:hAnsi="Times New Roman" w:cs="Times New Roman"/>
-          <w:lang w:val="tr-TR"/>
-          <w:vertAlign w:val="subscript"/>
-        </w:rPr>
-        <w:t xml:space="preserve">5</w:t>
-      </w:r>
-      <w:r>
-        <w:rPr>
-          <w:rFonts w:ascii="Times New Roman" w:hAnsi="Times New Roman" w:cs="Times New Roman"/>
-          <w:lang w:val="tr-TR"/>
-        </w:rPr>
-        <w:t xml:space="preserve">H</w:t>
-      </w:r>
-      <w:r>
-        <w:rPr>
-          <w:rFonts w:ascii="Times New Roman" w:hAnsi="Times New Roman" w:cs="Times New Roman"/>
-          <w:lang w:val="tr-TR"/>
-          <w:vertAlign w:val="subscript"/>
-        </w:rPr>
-        <w:t xml:space="preserve">12</w:t>
-      </w:r>
-      <w:r>
-        <w:rPr>
-          <w:rFonts w:ascii="Times New Roman" w:hAnsi="Times New Roman" w:cs="Times New Roman"/>
-          <w:lang w:val="tr-TR"/>
-        </w:rPr>
-        <w:t xml:space="preserve">O).</w:t>
       </w:r>
     </w:p>
     <w:p xmlns:a="http://schemas.openxmlformats.org/drawingml/2006/main" xmlns:pic="http://schemas.openxmlformats.org/drawingml/2006/picture">

</xml_diff>

<commit_message>
2.4-2.5: formul tablosu, hidrokarbon kartlari, siniflandirma semasi ve cizgi-bag gorselleri baski boyutunda yeniden cizildi
</commit_message>
<xml_diff>
--- a/Kim12-2-4-Organik-Bilesiklerin-Formulleri.docx
+++ b/Kim12-2-4-Organik-Bilesiklerin-Formulleri.docx
@@ -1108,7 +1108,7 @@
       <w:r>
         <w:drawing>
           <wp:inline distT="0" distB="0" distL="0" distR="0">
-            <wp:extent cx="5760000" cy="5485714"/>
+            <wp:extent cx="5596139" cy="5199898"/>
             <wp:docPr id="900002" name="Grafik 900002" descr="Bazı organik bileşiklerin uzay dolgu modelleri ile açık, yarı açık ve çizgi-bağ formülleri"/>
             <wp:cNvGraphicFramePr>
               <a:graphicFrameLocks noChangeAspect="1"/>
@@ -1129,7 +1129,7 @@
                   <pic:spPr>
                     <a:xfrm>
                       <a:off x="0" y="0"/>
-                      <a:ext cx="5760000" cy="5485714"/>
+                      <a:ext cx="5596139" cy="5199898"/>
                     </a:xfrm>
                     <a:prstGeom prst="rect">
                       <a:avLst/>
@@ -6532,7 +6532,7 @@
       <w:r>
         <w:drawing>
           <wp:inline distT="0" distB="0" distL="0" distR="0">
-            <wp:extent cx="4680000" cy="1004137"/>
+            <wp:extent cx="4678689" cy="935737"/>
             <wp:docPr id="900013" name="Grafik 900013" descr="Çizgi-bağ formülleri"/>
             <wp:cNvGraphicFramePr>
               <a:graphicFrameLocks noChangeAspect="1"/>
@@ -6553,7 +6553,7 @@
                   <pic:spPr>
                     <a:xfrm>
                       <a:off x="0" y="0"/>
-                      <a:ext cx="4680000" cy="1004137"/>
+                      <a:ext cx="4678689" cy="935737"/>
                     </a:xfrm>
                     <a:prstGeom prst="rect">
                       <a:avLst/>

</xml_diff>

<commit_message>
Kim12-2-4-Organik-Bilesiklerin-Formulleri: gorsel alanlarina Shutter onizlemeleri yerlestirildi (2.3 bicimi)
</commit_message>
<xml_diff>
--- a/Kim12-2-4-Organik-Bilesiklerin-Formulleri.docx
+++ b/Kim12-2-4-Organik-Bilesiklerin-Formulleri.docx
@@ -22,165 +22,113 @@
         <w:t xml:space="preserve">BÖLÜM: Organik Bileşikler</w:t>
       </w:r>
     </w:p>
-    <w:tbl>
-      <w:tblPr>
-        <w:tblW w:w="9000" w:type="dxa"/>
+    <w:p>
+      <w:pPr>
         <w:jc w:val="center"/>
-        <w:tblBorders>
-          <w:top w:val="single" w:sz="8" w:space="0" w:color="7F7F7F"/>
-          <w:left w:val="single" w:sz="8" w:space="0" w:color="7F7F7F"/>
-          <w:bottom w:val="single" w:sz="8" w:space="0" w:color="7F7F7F"/>
-          <w:right w:val="single" w:sz="8" w:space="0" w:color="7F7F7F"/>
-        </w:tblBorders>
-      </w:tblPr>
-      <w:tblGrid>
-        <w:gridCol w:w="9000"/>
-      </w:tblGrid>
-      <w:tr>
-        <w:tc>
-          <w:tcPr>
-            <w:tcW w:w="9000" w:type="dxa"/>
-            <w:shd w:val="clear" w:color="auto" w:fill="EDEDED"/>
-          </w:tcPr>
-          <w:p>
-            <w:pPr>
-              <w:jc w:val="both"/>
-              <w:rPr>
-                <w:rFonts w:ascii="Times New Roman" w:hAnsi="Times New Roman" w:cs="Times New Roman"/>
-                <w:lang w:val="tr-TR"/>
-              </w:rPr>
-            </w:pPr>
-            <w:r>
-              <w:rPr>
-                <w:rFonts w:ascii="Times New Roman" w:hAnsi="Times New Roman" w:cs="Times New Roman"/>
-                <w:lang w:val="tr-TR"/>
-              </w:rPr>
-              <w:t xml:space="preserve">GÖRSEL ALANI (Bölüm kapağı, tam sayfa; Shutterstock)</w:t>
-            </w:r>
-          </w:p>
-          <w:p>
-            <w:pPr>
-              <w:jc w:val="both"/>
-              <w:rPr>
-                <w:rFonts w:ascii="Times New Roman" w:hAnsi="Times New Roman" w:cs="Times New Roman"/>
-                <w:lang w:val="tr-TR"/>
-              </w:rPr>
-            </w:pPr>
-            <w:r>
-              <w:rPr>
-                <w:rFonts w:ascii="Times New Roman" w:hAnsi="Times New Roman" w:cs="Times New Roman"/>
-                <w:lang w:val="tr-TR"/>
-              </w:rPr>
-              <w:t xml:space="preserve">Tarif: Gece aydınlatılmış bir petrokimya tesisi: damıtma kuleleri, borular ve depolama tankları; endüstriyel ama estetik bir manzara (tam sayfa bölüm kapağı).</w:t>
-            </w:r>
-          </w:p>
-          <w:p>
-            <w:pPr>
-              <w:jc w:val="both"/>
-              <w:rPr>
-                <w:rFonts w:ascii="Times New Roman" w:hAnsi="Times New Roman" w:cs="Times New Roman"/>
-                <w:lang w:val="tr-TR"/>
-              </w:rPr>
-            </w:pPr>
-            <w:r>
-              <w:rPr>
-                <w:rFonts w:ascii="Times New Roman" w:hAnsi="Times New Roman" w:cs="Times New Roman"/>
-                <w:lang w:val="tr-TR"/>
-              </w:rPr>
-              <w:t xml:space="preserve">Shutter ID: 2722731869 (fotoğraf) — Illuminated oil refinery chemical plant at night</w:t>
-            </w:r>
-          </w:p>
-        </w:tc>
-      </w:tr>
-    </w:tbl>
-    <w:p>
-      <w:pPr>
-        <w:jc w:val="both"/>
-        <w:rPr>
-          <w:rFonts w:ascii="Times New Roman" w:hAnsi="Times New Roman" w:cs="Times New Roman"/>
-          <w:lang w:val="tr-TR"/>
-        </w:rPr>
-      </w:pPr>
-    </w:p>
-    <w:tbl>
-      <w:tblPr>
-        <w:tblW w:w="9000" w:type="dxa"/>
+      </w:pPr>
+      <w:r>
+        <w:drawing>
+          <wp:inline xmlns:a="http://schemas.openxmlformats.org/drawingml/2006/main" xmlns:pic="http://schemas.openxmlformats.org/drawingml/2006/picture">
+            <wp:extent cx="5400000" cy="3258000"/>
+            <wp:docPr id="900016" name="Picture 900016"/>
+            <wp:cNvGraphicFramePr>
+              <a:graphicFrameLocks noChangeAspect="1"/>
+            </wp:cNvGraphicFramePr>
+            <a:graphic>
+              <a:graphicData uri="http://schemas.openxmlformats.org/drawingml/2006/picture">
+                <pic:pic>
+                  <pic:nvPicPr>
+                    <pic:cNvPr id="0" name="2722731869_d.jpg"/>
+                    <pic:cNvPicPr/>
+                  </pic:nvPicPr>
+                  <pic:blipFill>
+                    <a:blip r:embed="rId11"/>
+                    <a:stretch>
+                      <a:fillRect/>
+                    </a:stretch>
+                  </pic:blipFill>
+                  <pic:spPr>
+                    <a:xfrm>
+                      <a:off x="0" y="0"/>
+                      <a:ext cx="5400000" cy="3258000"/>
+                    </a:xfrm>
+                    <a:prstGeom prst="rect"/>
+                  </pic:spPr>
+                </pic:pic>
+              </a:graphicData>
+            </a:graphic>
+          </wp:inline>
+        </w:drawing>
+      </w:r>
+    </w:p>
+    <w:p>
+      <w:pPr>
         <w:jc w:val="center"/>
-        <w:tblBorders>
-          <w:top w:val="single" w:sz="8" w:space="0" w:color="7F7F7F"/>
-          <w:left w:val="single" w:sz="8" w:space="0" w:color="7F7F7F"/>
-          <w:bottom w:val="single" w:sz="8" w:space="0" w:color="7F7F7F"/>
-          <w:right w:val="single" w:sz="8" w:space="0" w:color="7F7F7F"/>
-        </w:tblBorders>
-      </w:tblPr>
-      <w:tblGrid>
-        <w:gridCol w:w="9000"/>
-      </w:tblGrid>
-      <w:tr>
-        <w:tc>
-          <w:tcPr>
-            <w:tcW w:w="9000" w:type="dxa"/>
-            <w:shd w:val="clear" w:color="auto" w:fill="EDEDED"/>
-          </w:tcPr>
-          <w:p>
-            <w:pPr>
-              <w:jc w:val="both"/>
-              <w:rPr>
-                <w:rFonts w:ascii="Times New Roman" w:hAnsi="Times New Roman" w:cs="Times New Roman"/>
-                <w:lang w:val="tr-TR"/>
-              </w:rPr>
-            </w:pPr>
-            <w:r>
-              <w:rPr>
-                <w:rFonts w:ascii="Times New Roman" w:hAnsi="Times New Roman" w:cs="Times New Roman"/>
-                <w:lang w:val="tr-TR"/>
-              </w:rPr>
-              <w:t xml:space="preserve">GÖRSEL ALANI (Shutterstock)</w:t>
-            </w:r>
-          </w:p>
-          <w:p>
-            <w:pPr>
-              <w:jc w:val="both"/>
-              <w:rPr>
-                <w:rFonts w:ascii="Times New Roman" w:hAnsi="Times New Roman" w:cs="Times New Roman"/>
-                <w:lang w:val="tr-TR"/>
-              </w:rPr>
-            </w:pPr>
-            <w:r>
-              <w:rPr>
-                <w:rFonts w:ascii="Times New Roman" w:hAnsi="Times New Roman" w:cs="Times New Roman"/>
-                <w:lang w:val="tr-TR"/>
-              </w:rPr>
-              <w:t xml:space="preserve">Tarif: Açık renkli bir masa üzerinde yan yana ilaç tabletleri, renkli plastik saklama kapları, pamuklu ve sentetik kumaş parçaları, bir mum, bir şişe zeytinyağı ve bir kâse şekerden oluşan kompozisyon (marka/logo görünmesin).</w:t>
-            </w:r>
-          </w:p>
-          <w:p>
-            <w:pPr>
-              <w:jc w:val="both"/>
-              <w:rPr>
-                <w:rFonts w:ascii="Times New Roman" w:hAnsi="Times New Roman" w:cs="Times New Roman"/>
-                <w:lang w:val="tr-TR"/>
-              </w:rPr>
-            </w:pPr>
-            <w:r>
-              <w:rPr>
-                <w:rFonts w:ascii="Times New Roman" w:hAnsi="Times New Roman" w:cs="Times New Roman"/>
-                <w:lang w:val="tr-TR"/>
-              </w:rPr>
-              <w:t xml:space="preserve">Shutter ID: 2131157147 (fotoğraf) — Eco-friendly everyday products flat lay (bamboo, glass, cotton)</w:t>
-            </w:r>
-          </w:p>
-        </w:tc>
-      </w:tr>
-    </w:tbl>
-    <w:p>
-      <w:pPr>
-        <w:jc w:val="both"/>
-        <w:rPr>
-          <w:rFonts w:ascii="Times New Roman" w:hAnsi="Times New Roman" w:cs="Times New Roman"/>
-          <w:lang w:val="tr-TR"/>
-        </w:rPr>
-      </w:pPr>
+      </w:pPr>
+      <w:r>
+        <w:rPr>
+          <w:rFonts w:ascii="Times New Roman" w:hAnsi="Times New Roman" w:cs="Times New Roman"/>
+          <w:b/>
+          <w:bCs/>
+          <w:highlight w:val="yellow"/>
+          <w:lang w:val="tr-TR"/>
+        </w:rPr>
+        <w:t xml:space="preserve">Shutter id: 2722731869 (bölüm kapağı, tam sayfa)</w:t>
+      </w:r>
+    </w:p>
+    <w:p>
+      <w:pPr>
+        <w:jc w:val="center"/>
+      </w:pPr>
+      <w:r>
+        <w:drawing>
+          <wp:inline xmlns:a="http://schemas.openxmlformats.org/drawingml/2006/main" xmlns:pic="http://schemas.openxmlformats.org/drawingml/2006/picture">
+            <wp:extent cx="3430127" cy="2520000"/>
+            <wp:docPr id="900017" name="Picture 900017"/>
+            <wp:cNvGraphicFramePr>
+              <a:graphicFrameLocks noChangeAspect="1"/>
+            </wp:cNvGraphicFramePr>
+            <a:graphic>
+              <a:graphicData uri="http://schemas.openxmlformats.org/drawingml/2006/picture">
+                <pic:pic>
+                  <pic:nvPicPr>
+                    <pic:cNvPr id="0" name="2131157147_d.jpg"/>
+                    <pic:cNvPicPr/>
+                  </pic:nvPicPr>
+                  <pic:blipFill>
+                    <a:blip r:embed="rId12"/>
+                    <a:stretch>
+                      <a:fillRect/>
+                    </a:stretch>
+                  </pic:blipFill>
+                  <pic:spPr>
+                    <a:xfrm>
+                      <a:off x="0" y="0"/>
+                      <a:ext cx="3430127" cy="2520000"/>
+                    </a:xfrm>
+                    <a:prstGeom prst="rect"/>
+                  </pic:spPr>
+                </pic:pic>
+              </a:graphicData>
+            </a:graphic>
+          </wp:inline>
+        </w:drawing>
+      </w:r>
+    </w:p>
+    <w:p>
+      <w:pPr>
+        <w:jc w:val="center"/>
+      </w:pPr>
+      <w:r>
+        <w:rPr>
+          <w:rFonts w:ascii="Times New Roman" w:hAnsi="Times New Roman" w:cs="Times New Roman"/>
+          <w:b/>
+          <w:bCs/>
+          <w:highlight w:val="yellow"/>
+          <w:lang w:val="tr-TR"/>
+        </w:rPr>
+        <w:t xml:space="preserve">Shutter id: 2131157147</w:t>
+      </w:r>
     </w:p>
     <w:p>
       <w:pPr>
@@ -781,99 +729,73 @@
         <w:t xml:space="preserve">O formülüyle gösterilir. Peki aynı sayıda ve aynı türde atomlardan oluşan iki molekül nasıl farklı maddeler olabilir? Bir organik bileşiği kâğıt üzerinde gösterirken hangi bilgileri vermek gerekir? Kimyacılar aynı bileşik için neden farklı formüller kullanır? Bu soruların cevabını bir etkinlik yaparak keşfediniz. Analiz ve Keşif Atölyesi 2.4.’te tümevarımsal akıl yürüteceksiniz: Farklı formüllerle ve uzay dolgu modelleriyle gösterilen organik bileşikleri gözlemleyecek, bu gösterimler arasındaki örüntüleri bulacak ve bulduğunuz örüntülerden yola çıkarak organik bileşiklerin yapı formüllerine ilişkin bir genellemeye ulaşacaksınız. Modelleri ve formülleri dikkatle okuyup yorumlamanız görsel okuryazarlığınızı geliştirecek; genellemenizi kanıtlarla sınayıp gerektiğinde düzeltmeniz gerçeği arama eğiliminizi güçlendirecektir. Etkinlik boyunca kendinize hedef belirleyip çalışmanızı değerlendirerek öğrenme sürecinizi de yöneteceksiniz.</w:t>
       </w:r>
     </w:p>
-    <w:tbl>
-      <w:tblPr>
-        <w:tblW w:w="9000" w:type="dxa"/>
+    <w:p>
+      <w:pPr>
         <w:jc w:val="center"/>
-        <w:tblBorders>
-          <w:top w:val="single" w:sz="8" w:space="0" w:color="7F7F7F"/>
-          <w:left w:val="single" w:sz="8" w:space="0" w:color="7F7F7F"/>
-          <w:bottom w:val="single" w:sz="8" w:space="0" w:color="7F7F7F"/>
-          <w:right w:val="single" w:sz="8" w:space="0" w:color="7F7F7F"/>
-        </w:tblBorders>
-      </w:tblPr>
-      <w:tblGrid>
-        <w:gridCol w:w="9000"/>
-      </w:tblGrid>
-      <w:tr>
-        <w:tc>
-          <w:tcPr>
-            <w:tcW w:w="9000" w:type="dxa"/>
-            <w:shd w:val="clear" w:color="auto" w:fill="EDEDED"/>
-          </w:tcPr>
-          <w:p>
-            <w:pPr>
-              <w:jc w:val="both"/>
-              <w:rPr>
-                <w:rFonts w:ascii="Times New Roman" w:hAnsi="Times New Roman" w:cs="Times New Roman"/>
-                <w:lang w:val="tr-TR"/>
-              </w:rPr>
-            </w:pPr>
-            <w:r>
-              <w:rPr>
-                <w:rFonts w:ascii="Times New Roman" w:hAnsi="Times New Roman" w:cs="Times New Roman"/>
-                <w:lang w:val="tr-TR"/>
-              </w:rPr>
-              <w:t xml:space="preserve">GÖRSEL ALANI (Shutterstock)</w:t>
-            </w:r>
-          </w:p>
-          <w:p>
-            <w:pPr>
-              <w:jc w:val="both"/>
-              <w:rPr>
-                <w:rFonts w:ascii="Times New Roman" w:hAnsi="Times New Roman" w:cs="Times New Roman"/>
-                <w:lang w:val="tr-TR"/>
-              </w:rPr>
-            </w:pPr>
-            <w:r>
-              <w:rPr>
-                <w:rFonts w:ascii="Times New Roman" w:hAnsi="Times New Roman" w:cs="Times New Roman"/>
-                <w:lang w:val="tr-TR"/>
-              </w:rPr>
-              <w:t xml:space="preserve">Tarif: Cam bir kolonya şişesinden avuç içine kolonya dökülmesi; arka planda limon dilimleri (marka/logo görünmesin).</w:t>
-            </w:r>
-          </w:p>
-          <w:p>
-            <w:pPr>
-              <w:jc w:val="both"/>
-              <w:rPr>
-                <w:rFonts w:ascii="Times New Roman" w:hAnsi="Times New Roman" w:cs="Times New Roman"/>
-                <w:lang w:val="tr-TR"/>
-              </w:rPr>
-            </w:pPr>
-            <w:r>
-              <w:rPr>
-                <w:rFonts w:ascii="Times New Roman" w:hAnsi="Times New Roman" w:cs="Times New Roman"/>
-                <w:lang w:val="tr-TR"/>
-              </w:rPr>
-              <w:t xml:space="preserve">Shutter ID: 2757743379 (fotoğraf) — Traditional Turkish hospitality with cologne</w:t>
-            </w:r>
-          </w:p>
-        </w:tc>
-      </w:tr>
-    </w:tbl>
-    <w:p>
-      <w:pPr>
-        <w:jc w:val="both"/>
-        <w:rPr>
-          <w:rFonts w:ascii="Times New Roman" w:hAnsi="Times New Roman" w:cs="Times New Roman"/>
-          <w:lang w:val="tr-TR"/>
-        </w:rPr>
-      </w:pPr>
+      </w:pPr>
+      <w:r>
+        <w:drawing>
+          <wp:inline xmlns:a="http://schemas.openxmlformats.org/drawingml/2006/main" xmlns:pic="http://schemas.openxmlformats.org/drawingml/2006/picture">
+            <wp:extent cx="4008483" cy="2520000"/>
+            <wp:docPr id="900018" name="Picture 900018"/>
+            <wp:cNvGraphicFramePr>
+              <a:graphicFrameLocks noChangeAspect="1"/>
+            </wp:cNvGraphicFramePr>
+            <a:graphic>
+              <a:graphicData uri="http://schemas.openxmlformats.org/drawingml/2006/picture">
+                <pic:pic>
+                  <pic:nvPicPr>
+                    <pic:cNvPr id="0" name="2757743379_d.jpg"/>
+                    <pic:cNvPicPr/>
+                  </pic:nvPicPr>
+                  <pic:blipFill>
+                    <a:blip r:embed="rId13"/>
+                    <a:stretch>
+                      <a:fillRect/>
+                    </a:stretch>
+                  </pic:blipFill>
+                  <pic:spPr>
+                    <a:xfrm>
+                      <a:off x="0" y="0"/>
+                      <a:ext cx="4008483" cy="2520000"/>
+                    </a:xfrm>
+                    <a:prstGeom prst="rect"/>
+                  </pic:spPr>
+                </pic:pic>
+              </a:graphicData>
+            </a:graphic>
+          </wp:inline>
+        </w:drawing>
+      </w:r>
     </w:p>
     <w:p>
       <w:pPr>
         <w:jc w:val="center"/>
-        <w:rPr>
-          <w:rFonts w:ascii="Times New Roman" w:hAnsi="Times New Roman" w:cs="Times New Roman"/>
-          <w:lang w:val="tr-TR"/>
-        </w:rPr>
       </w:pPr>
       <w:r>
         <w:rPr>
           <w:rFonts w:ascii="Times New Roman" w:hAnsi="Times New Roman" w:cs="Times New Roman"/>
           <w:b/>
           <w:bCs/>
+          <w:highlight w:val="yellow"/>
+          <w:lang w:val="tr-TR"/>
+        </w:rPr>
+        <w:t xml:space="preserve">Shutter id: 2757743379</w:t>
+      </w:r>
+    </w:p>
+    <w:p>
+      <w:pPr>
+        <w:jc w:val="center"/>
+        <w:rPr>
+          <w:rFonts w:ascii="Times New Roman" w:hAnsi="Times New Roman" w:cs="Times New Roman"/>
+          <w:lang w:val="tr-TR"/>
+        </w:rPr>
+      </w:pPr>
+      <w:r>
+        <w:rPr>
+          <w:rFonts w:ascii="Times New Roman" w:hAnsi="Times New Roman" w:cs="Times New Roman"/>
+          <w:b/>
+          <w:bCs/>
           <w:lang w:val="tr-TR"/>
         </w:rPr>
         <w:t xml:space="preserve">Görsel B:</w:t>
@@ -886,85 +808,59 @@
         <w:t xml:space="preserve"> Kolonya</w:t>
       </w:r>
     </w:p>
-    <w:tbl>
-      <w:tblPr>
-        <w:tblW w:w="9000" w:type="dxa"/>
+    <w:p>
+      <w:pPr>
         <w:jc w:val="center"/>
-        <w:tblBorders>
-          <w:top w:val="single" w:sz="8" w:space="0" w:color="7F7F7F"/>
-          <w:left w:val="single" w:sz="8" w:space="0" w:color="7F7F7F"/>
-          <w:bottom w:val="single" w:sz="8" w:space="0" w:color="7F7F7F"/>
-          <w:right w:val="single" w:sz="8" w:space="0" w:color="7F7F7F"/>
-        </w:tblBorders>
-      </w:tblPr>
-      <w:tblGrid>
-        <w:gridCol w:w="9000"/>
-      </w:tblGrid>
-      <w:tr>
-        <w:tc>
-          <w:tcPr>
-            <w:tcW w:w="9000" w:type="dxa"/>
-            <w:shd w:val="clear" w:color="auto" w:fill="EDEDED"/>
-          </w:tcPr>
-          <w:p>
-            <w:pPr>
-              <w:jc w:val="both"/>
-              <w:rPr>
-                <w:rFonts w:ascii="Times New Roman" w:hAnsi="Times New Roman" w:cs="Times New Roman"/>
-                <w:lang w:val="tr-TR"/>
-              </w:rPr>
-            </w:pPr>
-            <w:r>
-              <w:rPr>
-                <w:rFonts w:ascii="Times New Roman" w:hAnsi="Times New Roman" w:cs="Times New Roman"/>
-                <w:lang w:val="tr-TR"/>
-              </w:rPr>
-              <w:t xml:space="preserve">GÖRSEL ALANI (Shutterstock)</w:t>
-            </w:r>
-          </w:p>
-          <w:p>
-            <w:pPr>
-              <w:jc w:val="both"/>
-              <w:rPr>
-                <w:rFonts w:ascii="Times New Roman" w:hAnsi="Times New Roman" w:cs="Times New Roman"/>
-                <w:lang w:val="tr-TR"/>
-              </w:rPr>
-            </w:pPr>
-            <w:r>
-              <w:rPr>
-                <w:rFonts w:ascii="Times New Roman" w:hAnsi="Times New Roman" w:cs="Times New Roman"/>
-                <w:lang w:val="tr-TR"/>
-              </w:rPr>
-              <w:t xml:space="preserve">Tarif: Bir yüzeye boya püskürten sprey boya kutusu, kutudan çıkan ince sis belirgin (marka/logo görünmesin).</w:t>
-            </w:r>
-          </w:p>
-          <w:p>
-            <w:pPr>
-              <w:jc w:val="both"/>
-              <w:rPr>
-                <w:rFonts w:ascii="Times New Roman" w:hAnsi="Times New Roman" w:cs="Times New Roman"/>
-                <w:lang w:val="tr-TR"/>
-              </w:rPr>
-            </w:pPr>
-            <w:r>
-              <w:rPr>
-                <w:rFonts w:ascii="Times New Roman" w:hAnsi="Times New Roman" w:cs="Times New Roman"/>
-                <w:lang w:val="tr-TR"/>
-              </w:rPr>
-              <w:t xml:space="preserve">Shutter ID: 2482860823 (fotoğraf) — Man with can of spray paint</w:t>
-            </w:r>
-          </w:p>
-        </w:tc>
-      </w:tr>
-    </w:tbl>
-    <w:p>
-      <w:pPr>
-        <w:jc w:val="both"/>
-        <w:rPr>
-          <w:rFonts w:ascii="Times New Roman" w:hAnsi="Times New Roman" w:cs="Times New Roman"/>
-          <w:lang w:val="tr-TR"/>
-        </w:rPr>
-      </w:pPr>
+      </w:pPr>
+      <w:r>
+        <w:drawing>
+          <wp:inline xmlns:a="http://schemas.openxmlformats.org/drawingml/2006/main" xmlns:pic="http://schemas.openxmlformats.org/drawingml/2006/picture">
+            <wp:extent cx="2590815" cy="2519999"/>
+            <wp:docPr id="900019" name="Picture 900019"/>
+            <wp:cNvGraphicFramePr>
+              <a:graphicFrameLocks noChangeAspect="1"/>
+            </wp:cNvGraphicFramePr>
+            <a:graphic>
+              <a:graphicData uri="http://schemas.openxmlformats.org/drawingml/2006/picture">
+                <pic:pic>
+                  <pic:nvPicPr>
+                    <pic:cNvPr id="0" name="2482860823_d.jpg"/>
+                    <pic:cNvPicPr/>
+                  </pic:nvPicPr>
+                  <pic:blipFill>
+                    <a:blip r:embed="rId14"/>
+                    <a:stretch>
+                      <a:fillRect/>
+                    </a:stretch>
+                  </pic:blipFill>
+                  <pic:spPr>
+                    <a:xfrm>
+                      <a:off x="0" y="0"/>
+                      <a:ext cx="2590815" cy="2519999"/>
+                    </a:xfrm>
+                    <a:prstGeom prst="rect"/>
+                  </pic:spPr>
+                </pic:pic>
+              </a:graphicData>
+            </a:graphic>
+          </wp:inline>
+        </w:drawing>
+      </w:r>
+    </w:p>
+    <w:p>
+      <w:pPr>
+        <w:jc w:val="center"/>
+      </w:pPr>
+      <w:r>
+        <w:rPr>
+          <w:rFonts w:ascii="Times New Roman" w:hAnsi="Times New Roman" w:cs="Times New Roman"/>
+          <w:b/>
+          <w:bCs/>
+          <w:highlight w:val="yellow"/>
+          <w:lang w:val="tr-TR"/>
+        </w:rPr>
+        <w:t xml:space="preserve">Shutter id: 2482860823</w:t>
+      </w:r>
     </w:p>
     <w:p>
       <w:pPr>

</xml_diff>